<commit_message>
Add screenshot evidence placeholders Appendix A (IR-01 to IR-15)
</commit_message>
<xml_diff>
--- a/IT3041_Individual_Audit_Student4_Information_Retrieval_and_Security_Assessment.docx
+++ b/IT3041_Individual_Audit_Student4_Information_Retrieval_and_Security_Assessment.docx
@@ -5989,6 +5989,1224 @@
         <w:t>OWASP Top Ten for Large Language Model Applications. OWASP Foundation. NIST Artificial Intelligence Risk Management Framework. ISO and IEC 23894 on Artificial Intelligence Risk Management. MITRE ATLAS Adversarial Threat Landscape for Artificial Intelligence Systems.</w:t>
       </w:r>
     </w:p>
+    <w:p>
+      <w:r>
+        <w:br w:type="page"/>
+      </w:r>
+    </w:p>
+    <w:p>
+      <w:pPr>
+        <w:pStyle w:val="Heading1"/>
+      </w:pPr>
+      <w:r>
+        <w:t>Appendix A: Testing Evidence – Screenshots</w:t>
+      </w:r>
+    </w:p>
+    <w:p>
+      <w:pPr>
+        <w:jc w:val="both"/>
+      </w:pPr>
+      <w:r>
+        <w:rPr>
+          <w:rFonts w:ascii="Times New Roman" w:hAnsi="Times New Roman"/>
+          <w:sz w:val="24"/>
+        </w:rPr>
+        <w:t>This appendix provides numbered slots for the supporting screenshots and logs required by the assignment. Replace each placeholder box with the corresponding captured image, keeping the caption. Do not delete the caption so that each test case in Section 3 traces to exactly one figure.</w:t>
+      </w:r>
+    </w:p>
+    <w:p>
+      <w:pPr>
+        <w:jc w:val="both"/>
+      </w:pPr>
+      <w:r>
+        <w:rPr>
+          <w:rFonts w:ascii="Times New Roman" w:hAnsi="Times New Roman"/>
+          <w:i/>
+          <w:sz w:val="22"/>
+        </w:rPr>
+        <w:t>How to use: click inside the grey box, delete the instruction line, then Insert &gt; Pictures &gt; This Device. Resize to fit page width. Keep the caption below the image.</w:t>
+      </w:r>
+    </w:p>
+    <w:p>
+      <w:pPr>
+        <w:pStyle w:val="Heading2"/>
+      </w:pPr>
+      <w:r>
+        <w:t>Figure A.1 – Evidence for IR-01</w:t>
+      </w:r>
+    </w:p>
+    <w:p>
+      <w:pPr>
+        <w:jc w:val="center"/>
+        <w:shd w:val="clear" w:fill="EDEDED"/>
+        <w:pBdr>
+          <w:top w:val="single" w:sz="6" w:color="999999"/>
+          <w:left w:val="single" w:sz="6" w:color="999999"/>
+          <w:bottom w:val="single" w:sz="6" w:color="999999"/>
+          <w:right w:val="single" w:sz="6" w:color="999999"/>
+        </w:pBdr>
+      </w:pPr>
+      <w:r>
+        <w:rPr>
+          <w:rFonts w:ascii="Times New Roman" w:hAnsi="Times New Roman"/>
+          <w:color w:val="666666"/>
+          <w:sz w:val="22"/>
+        </w:rPr>
+        <w:t>[ INSERT SCREENSHOT for IR-01 HERE ]</w:t>
+        <w:br/>
+        <w:t>Double-click here after inserting: recommended content – query as entered, full system response showing safety fields, and visible timestamp.</w:t>
+      </w:r>
+    </w:p>
+    <w:p>
+      <w:pPr>
+        <w:jc w:val="center"/>
+      </w:pPr>
+      <w:r>
+        <w:rPr>
+          <w:rFonts w:ascii="Times New Roman" w:hAnsi="Times New Roman"/>
+          <w:i/>
+          <w:sz w:val="20"/>
+        </w:rPr>
+        <w:t>Figure A.1: Supporting evidence for test IR-01. Author to add one-line observation below the image.</w:t>
+      </w:r>
+    </w:p>
+    <w:p>
+      <w:pPr>
+        <w:pStyle w:val="Heading2"/>
+      </w:pPr>
+      <w:r>
+        <w:t>Figure A.2 – Evidence for IR-02</w:t>
+      </w:r>
+    </w:p>
+    <w:p>
+      <w:pPr>
+        <w:jc w:val="center"/>
+        <w:shd w:val="clear" w:fill="EDEDED"/>
+        <w:pBdr>
+          <w:top w:val="single" w:sz="6" w:color="999999"/>
+          <w:left w:val="single" w:sz="6" w:color="999999"/>
+          <w:bottom w:val="single" w:sz="6" w:color="999999"/>
+          <w:right w:val="single" w:sz="6" w:color="999999"/>
+        </w:pBdr>
+      </w:pPr>
+      <w:r>
+        <w:rPr>
+          <w:rFonts w:ascii="Times New Roman" w:hAnsi="Times New Roman"/>
+          <w:color w:val="666666"/>
+          <w:sz w:val="22"/>
+        </w:rPr>
+        <w:t>[ INSERT SCREENSHOT for IR-02 HERE ]</w:t>
+        <w:br/>
+        <w:t>Double-click here after inserting: recommended content – query as entered, full system response showing safety fields, and visible timestamp.</w:t>
+      </w:r>
+    </w:p>
+    <w:p>
+      <w:pPr>
+        <w:jc w:val="center"/>
+      </w:pPr>
+      <w:r>
+        <w:rPr>
+          <w:rFonts w:ascii="Times New Roman" w:hAnsi="Times New Roman"/>
+          <w:i/>
+          <w:sz w:val="20"/>
+        </w:rPr>
+        <w:t>Figure A.2: Supporting evidence for test IR-02. Author to add one-line observation below the image.</w:t>
+      </w:r>
+    </w:p>
+    <w:p>
+      <w:pPr>
+        <w:pStyle w:val="Heading2"/>
+      </w:pPr>
+      <w:r>
+        <w:t>Figure A.3 – Evidence for IR-03</w:t>
+      </w:r>
+    </w:p>
+    <w:p>
+      <w:pPr>
+        <w:jc w:val="center"/>
+        <w:shd w:val="clear" w:fill="EDEDED"/>
+        <w:pBdr>
+          <w:top w:val="single" w:sz="6" w:color="999999"/>
+          <w:left w:val="single" w:sz="6" w:color="999999"/>
+          <w:bottom w:val="single" w:sz="6" w:color="999999"/>
+          <w:right w:val="single" w:sz="6" w:color="999999"/>
+        </w:pBdr>
+      </w:pPr>
+      <w:r>
+        <w:rPr>
+          <w:rFonts w:ascii="Times New Roman" w:hAnsi="Times New Roman"/>
+          <w:color w:val="666666"/>
+          <w:sz w:val="22"/>
+        </w:rPr>
+        <w:t>[ INSERT SCREENSHOT for IR-03 HERE ]</w:t>
+        <w:br/>
+        <w:t>Double-click here after inserting: recommended content – query as entered, full system response showing safety fields, and visible timestamp.</w:t>
+      </w:r>
+    </w:p>
+    <w:p>
+      <w:pPr>
+        <w:jc w:val="center"/>
+      </w:pPr>
+      <w:r>
+        <w:rPr>
+          <w:rFonts w:ascii="Times New Roman" w:hAnsi="Times New Roman"/>
+          <w:i/>
+          <w:sz w:val="20"/>
+        </w:rPr>
+        <w:t>Figure A.3: Supporting evidence for test IR-03. Author to add one-line observation below the image.</w:t>
+      </w:r>
+    </w:p>
+    <w:p>
+      <w:pPr>
+        <w:pStyle w:val="Heading2"/>
+      </w:pPr>
+      <w:r>
+        <w:t>Figure A.4 – Evidence for IR-04</w:t>
+      </w:r>
+    </w:p>
+    <w:p>
+      <w:pPr>
+        <w:jc w:val="center"/>
+        <w:shd w:val="clear" w:fill="EDEDED"/>
+        <w:pBdr>
+          <w:top w:val="single" w:sz="6" w:color="999999"/>
+          <w:left w:val="single" w:sz="6" w:color="999999"/>
+          <w:bottom w:val="single" w:sz="6" w:color="999999"/>
+          <w:right w:val="single" w:sz="6" w:color="999999"/>
+        </w:pBdr>
+      </w:pPr>
+      <w:r>
+        <w:rPr>
+          <w:rFonts w:ascii="Times New Roman" w:hAnsi="Times New Roman"/>
+          <w:color w:val="666666"/>
+          <w:sz w:val="22"/>
+        </w:rPr>
+        <w:t>[ INSERT SCREENSHOT for IR-04 HERE ]</w:t>
+        <w:br/>
+        <w:t>Double-click here after inserting: recommended content – query as entered, full system response showing safety fields, and visible timestamp.</w:t>
+      </w:r>
+    </w:p>
+    <w:p>
+      <w:pPr>
+        <w:jc w:val="center"/>
+      </w:pPr>
+      <w:r>
+        <w:rPr>
+          <w:rFonts w:ascii="Times New Roman" w:hAnsi="Times New Roman"/>
+          <w:i/>
+          <w:sz w:val="20"/>
+        </w:rPr>
+        <w:t>Figure A.4: Supporting evidence for test IR-04. Author to add one-line observation below the image.</w:t>
+      </w:r>
+    </w:p>
+    <w:p>
+      <w:pPr>
+        <w:pStyle w:val="Heading2"/>
+      </w:pPr>
+      <w:r>
+        <w:t>Figure A.5 – Evidence for IR-05</w:t>
+      </w:r>
+    </w:p>
+    <w:p>
+      <w:pPr>
+        <w:jc w:val="center"/>
+        <w:shd w:val="clear" w:fill="EDEDED"/>
+        <w:pBdr>
+          <w:top w:val="single" w:sz="6" w:color="999999"/>
+          <w:left w:val="single" w:sz="6" w:color="999999"/>
+          <w:bottom w:val="single" w:sz="6" w:color="999999"/>
+          <w:right w:val="single" w:sz="6" w:color="999999"/>
+        </w:pBdr>
+      </w:pPr>
+      <w:r>
+        <w:rPr>
+          <w:rFonts w:ascii="Times New Roman" w:hAnsi="Times New Roman"/>
+          <w:color w:val="666666"/>
+          <w:sz w:val="22"/>
+        </w:rPr>
+        <w:t>[ INSERT SCREENSHOT for IR-05 HERE ]</w:t>
+        <w:br/>
+        <w:t>Double-click here after inserting: recommended content – query as entered, full system response showing safety fields, and visible timestamp.</w:t>
+      </w:r>
+    </w:p>
+    <w:p>
+      <w:pPr>
+        <w:jc w:val="center"/>
+      </w:pPr>
+      <w:r>
+        <w:rPr>
+          <w:rFonts w:ascii="Times New Roman" w:hAnsi="Times New Roman"/>
+          <w:i/>
+          <w:sz w:val="20"/>
+        </w:rPr>
+        <w:t>Figure A.5: Supporting evidence for test IR-05. Author to add one-line observation below the image.</w:t>
+      </w:r>
+    </w:p>
+    <w:p>
+      <w:pPr>
+        <w:pStyle w:val="Heading2"/>
+      </w:pPr>
+      <w:r>
+        <w:t>Figure A.6 – Evidence for IR-06</w:t>
+      </w:r>
+    </w:p>
+    <w:p>
+      <w:pPr>
+        <w:jc w:val="center"/>
+        <w:shd w:val="clear" w:fill="EDEDED"/>
+        <w:pBdr>
+          <w:top w:val="single" w:sz="6" w:color="999999"/>
+          <w:left w:val="single" w:sz="6" w:color="999999"/>
+          <w:bottom w:val="single" w:sz="6" w:color="999999"/>
+          <w:right w:val="single" w:sz="6" w:color="999999"/>
+        </w:pBdr>
+      </w:pPr>
+      <w:r>
+        <w:rPr>
+          <w:rFonts w:ascii="Times New Roman" w:hAnsi="Times New Roman"/>
+          <w:color w:val="666666"/>
+          <w:sz w:val="22"/>
+        </w:rPr>
+        <w:t>[ INSERT SCREENSHOT for IR-06 HERE ]</w:t>
+        <w:br/>
+        <w:t>Double-click here after inserting: recommended content – query as entered, full system response showing safety fields, and visible timestamp.</w:t>
+      </w:r>
+    </w:p>
+    <w:p>
+      <w:pPr>
+        <w:jc w:val="center"/>
+      </w:pPr>
+      <w:r>
+        <w:rPr>
+          <w:rFonts w:ascii="Times New Roman" w:hAnsi="Times New Roman"/>
+          <w:i/>
+          <w:sz w:val="20"/>
+        </w:rPr>
+        <w:t>Figure A.6: Supporting evidence for test IR-06. Author to add one-line observation below the image.</w:t>
+      </w:r>
+    </w:p>
+    <w:p>
+      <w:pPr>
+        <w:pStyle w:val="Heading2"/>
+      </w:pPr>
+      <w:r>
+        <w:t>Figure A.7 – Evidence for IR-07</w:t>
+      </w:r>
+    </w:p>
+    <w:p>
+      <w:pPr>
+        <w:jc w:val="center"/>
+        <w:shd w:val="clear" w:fill="EDEDED"/>
+        <w:pBdr>
+          <w:top w:val="single" w:sz="6" w:color="999999"/>
+          <w:left w:val="single" w:sz="6" w:color="999999"/>
+          <w:bottom w:val="single" w:sz="6" w:color="999999"/>
+          <w:right w:val="single" w:sz="6" w:color="999999"/>
+        </w:pBdr>
+      </w:pPr>
+      <w:r>
+        <w:rPr>
+          <w:rFonts w:ascii="Times New Roman" w:hAnsi="Times New Roman"/>
+          <w:color w:val="666666"/>
+          <w:sz w:val="22"/>
+        </w:rPr>
+        <w:t>[ INSERT SCREENSHOT for IR-07 HERE ]</w:t>
+        <w:br/>
+        <w:t>Double-click here after inserting: recommended content – query as entered, full system response showing safety fields, and visible timestamp.</w:t>
+      </w:r>
+    </w:p>
+    <w:p>
+      <w:pPr>
+        <w:jc w:val="center"/>
+      </w:pPr>
+      <w:r>
+        <w:rPr>
+          <w:rFonts w:ascii="Times New Roman" w:hAnsi="Times New Roman"/>
+          <w:i/>
+          <w:sz w:val="20"/>
+        </w:rPr>
+        <w:t>Figure A.7: Supporting evidence for test IR-07. Author to add one-line observation below the image.</w:t>
+      </w:r>
+    </w:p>
+    <w:p>
+      <w:pPr>
+        <w:pStyle w:val="Heading2"/>
+      </w:pPr>
+      <w:r>
+        <w:t>Figure A.8 – Evidence for IR-08</w:t>
+      </w:r>
+    </w:p>
+    <w:p>
+      <w:pPr>
+        <w:jc w:val="center"/>
+        <w:shd w:val="clear" w:fill="EDEDED"/>
+        <w:pBdr>
+          <w:top w:val="single" w:sz="6" w:color="999999"/>
+          <w:left w:val="single" w:sz="6" w:color="999999"/>
+          <w:bottom w:val="single" w:sz="6" w:color="999999"/>
+          <w:right w:val="single" w:sz="6" w:color="999999"/>
+        </w:pBdr>
+      </w:pPr>
+      <w:r>
+        <w:rPr>
+          <w:rFonts w:ascii="Times New Roman" w:hAnsi="Times New Roman"/>
+          <w:color w:val="666666"/>
+          <w:sz w:val="22"/>
+        </w:rPr>
+        <w:t>[ INSERT SCREENSHOT for IR-08 HERE ]</w:t>
+        <w:br/>
+        <w:t>Double-click here after inserting: recommended content – query as entered, full system response showing safety fields, and visible timestamp.</w:t>
+      </w:r>
+    </w:p>
+    <w:p>
+      <w:pPr>
+        <w:jc w:val="center"/>
+      </w:pPr>
+      <w:r>
+        <w:rPr>
+          <w:rFonts w:ascii="Times New Roman" w:hAnsi="Times New Roman"/>
+          <w:i/>
+          <w:sz w:val="20"/>
+        </w:rPr>
+        <w:t>Figure A.8: Supporting evidence for test IR-08. Author to add one-line observation below the image.</w:t>
+      </w:r>
+    </w:p>
+    <w:p>
+      <w:pPr>
+        <w:pStyle w:val="Heading2"/>
+      </w:pPr>
+      <w:r>
+        <w:t>Figure A.9 – Evidence for IR-09</w:t>
+      </w:r>
+    </w:p>
+    <w:p>
+      <w:pPr>
+        <w:jc w:val="center"/>
+        <w:shd w:val="clear" w:fill="EDEDED"/>
+        <w:pBdr>
+          <w:top w:val="single" w:sz="6" w:color="999999"/>
+          <w:left w:val="single" w:sz="6" w:color="999999"/>
+          <w:bottom w:val="single" w:sz="6" w:color="999999"/>
+          <w:right w:val="single" w:sz="6" w:color="999999"/>
+        </w:pBdr>
+      </w:pPr>
+      <w:r>
+        <w:rPr>
+          <w:rFonts w:ascii="Times New Roman" w:hAnsi="Times New Roman"/>
+          <w:color w:val="666666"/>
+          <w:sz w:val="22"/>
+        </w:rPr>
+        <w:t>[ INSERT SCREENSHOT for IR-09 HERE ]</w:t>
+        <w:br/>
+        <w:t>Double-click here after inserting: recommended content – query as entered, full system response showing safety fields, and visible timestamp.</w:t>
+      </w:r>
+    </w:p>
+    <w:p>
+      <w:pPr>
+        <w:jc w:val="center"/>
+      </w:pPr>
+      <w:r>
+        <w:rPr>
+          <w:rFonts w:ascii="Times New Roman" w:hAnsi="Times New Roman"/>
+          <w:i/>
+          <w:sz w:val="20"/>
+        </w:rPr>
+        <w:t>Figure A.9: Supporting evidence for test IR-09. Author to add one-line observation below the image.</w:t>
+      </w:r>
+    </w:p>
+    <w:p>
+      <w:pPr>
+        <w:pStyle w:val="Heading2"/>
+      </w:pPr>
+      <w:r>
+        <w:t>Figure A.10 – Evidence for IR-10</w:t>
+      </w:r>
+    </w:p>
+    <w:p>
+      <w:pPr>
+        <w:jc w:val="center"/>
+        <w:shd w:val="clear" w:fill="EDEDED"/>
+        <w:pBdr>
+          <w:top w:val="single" w:sz="6" w:color="999999"/>
+          <w:left w:val="single" w:sz="6" w:color="999999"/>
+          <w:bottom w:val="single" w:sz="6" w:color="999999"/>
+          <w:right w:val="single" w:sz="6" w:color="999999"/>
+        </w:pBdr>
+      </w:pPr>
+      <w:r>
+        <w:rPr>
+          <w:rFonts w:ascii="Times New Roman" w:hAnsi="Times New Roman"/>
+          <w:color w:val="666666"/>
+          <w:sz w:val="22"/>
+        </w:rPr>
+        <w:t>[ INSERT SCREENSHOT for IR-10 HERE ]</w:t>
+        <w:br/>
+        <w:t>Double-click here after inserting: recommended content – query as entered, full system response showing safety fields, and visible timestamp.</w:t>
+      </w:r>
+    </w:p>
+    <w:p>
+      <w:pPr>
+        <w:jc w:val="center"/>
+      </w:pPr>
+      <w:r>
+        <w:rPr>
+          <w:rFonts w:ascii="Times New Roman" w:hAnsi="Times New Roman"/>
+          <w:i/>
+          <w:sz w:val="20"/>
+        </w:rPr>
+        <w:t>Figure A.10: Supporting evidence for test IR-10. Author to add one-line observation below the image.</w:t>
+      </w:r>
+    </w:p>
+    <w:p>
+      <w:pPr>
+        <w:pStyle w:val="Heading2"/>
+      </w:pPr>
+      <w:r>
+        <w:t>Figure A.11 – Evidence for IR-11</w:t>
+      </w:r>
+    </w:p>
+    <w:p>
+      <w:pPr>
+        <w:jc w:val="center"/>
+        <w:shd w:val="clear" w:fill="EDEDED"/>
+        <w:pBdr>
+          <w:top w:val="single" w:sz="6" w:color="999999"/>
+          <w:left w:val="single" w:sz="6" w:color="999999"/>
+          <w:bottom w:val="single" w:sz="6" w:color="999999"/>
+          <w:right w:val="single" w:sz="6" w:color="999999"/>
+        </w:pBdr>
+      </w:pPr>
+      <w:r>
+        <w:rPr>
+          <w:rFonts w:ascii="Times New Roman" w:hAnsi="Times New Roman"/>
+          <w:color w:val="666666"/>
+          <w:sz w:val="22"/>
+        </w:rPr>
+        <w:t>[ INSERT SCREENSHOT for IR-11 HERE ]</w:t>
+        <w:br/>
+        <w:t>Double-click here after inserting: recommended content – query as entered, full system response showing safety fields, and visible timestamp.</w:t>
+      </w:r>
+    </w:p>
+    <w:p>
+      <w:pPr>
+        <w:jc w:val="center"/>
+      </w:pPr>
+      <w:r>
+        <w:rPr>
+          <w:rFonts w:ascii="Times New Roman" w:hAnsi="Times New Roman"/>
+          <w:i/>
+          <w:sz w:val="20"/>
+        </w:rPr>
+        <w:t>Figure A.11: Supporting evidence for test IR-11. Author to add one-line observation below the image.</w:t>
+      </w:r>
+    </w:p>
+    <w:p>
+      <w:pPr>
+        <w:pStyle w:val="Heading2"/>
+      </w:pPr>
+      <w:r>
+        <w:t>Figure A.12 – Evidence for IR-12</w:t>
+      </w:r>
+    </w:p>
+    <w:p>
+      <w:pPr>
+        <w:jc w:val="center"/>
+        <w:shd w:val="clear" w:fill="EDEDED"/>
+        <w:pBdr>
+          <w:top w:val="single" w:sz="6" w:color="999999"/>
+          <w:left w:val="single" w:sz="6" w:color="999999"/>
+          <w:bottom w:val="single" w:sz="6" w:color="999999"/>
+          <w:right w:val="single" w:sz="6" w:color="999999"/>
+        </w:pBdr>
+      </w:pPr>
+      <w:r>
+        <w:rPr>
+          <w:rFonts w:ascii="Times New Roman" w:hAnsi="Times New Roman"/>
+          <w:color w:val="666666"/>
+          <w:sz w:val="22"/>
+        </w:rPr>
+        <w:t>[ INSERT SCREENSHOT for IR-12 HERE ]</w:t>
+        <w:br/>
+        <w:t>Double-click here after inserting: recommended content – query as entered, full system response showing safety fields, and visible timestamp.</w:t>
+      </w:r>
+    </w:p>
+    <w:p>
+      <w:pPr>
+        <w:jc w:val="center"/>
+      </w:pPr>
+      <w:r>
+        <w:rPr>
+          <w:rFonts w:ascii="Times New Roman" w:hAnsi="Times New Roman"/>
+          <w:i/>
+          <w:sz w:val="20"/>
+        </w:rPr>
+        <w:t>Figure A.12: Supporting evidence for test IR-12. Author to add one-line observation below the image.</w:t>
+      </w:r>
+    </w:p>
+    <w:p>
+      <w:pPr>
+        <w:pStyle w:val="Heading2"/>
+      </w:pPr>
+      <w:r>
+        <w:t>Figure A.13 – Evidence for IR-13</w:t>
+      </w:r>
+    </w:p>
+    <w:p>
+      <w:pPr>
+        <w:jc w:val="center"/>
+        <w:shd w:val="clear" w:fill="EDEDED"/>
+        <w:pBdr>
+          <w:top w:val="single" w:sz="6" w:color="999999"/>
+          <w:left w:val="single" w:sz="6" w:color="999999"/>
+          <w:bottom w:val="single" w:sz="6" w:color="999999"/>
+          <w:right w:val="single" w:sz="6" w:color="999999"/>
+        </w:pBdr>
+      </w:pPr>
+      <w:r>
+        <w:rPr>
+          <w:rFonts w:ascii="Times New Roman" w:hAnsi="Times New Roman"/>
+          <w:color w:val="666666"/>
+          <w:sz w:val="22"/>
+        </w:rPr>
+        <w:t>[ INSERT SCREENSHOT for IR-13 HERE ]</w:t>
+        <w:br/>
+        <w:t>Double-click here after inserting: recommended content – query as entered, full system response showing safety fields, and visible timestamp.</w:t>
+      </w:r>
+    </w:p>
+    <w:p>
+      <w:pPr>
+        <w:jc w:val="center"/>
+      </w:pPr>
+      <w:r>
+        <w:rPr>
+          <w:rFonts w:ascii="Times New Roman" w:hAnsi="Times New Roman"/>
+          <w:i/>
+          <w:sz w:val="20"/>
+        </w:rPr>
+        <w:t>Figure A.13: Supporting evidence for test IR-13. Author to add one-line observation below the image.</w:t>
+      </w:r>
+    </w:p>
+    <w:p>
+      <w:pPr>
+        <w:pStyle w:val="Heading2"/>
+      </w:pPr>
+      <w:r>
+        <w:t>Figure A.14 – Evidence for IR-14</w:t>
+      </w:r>
+    </w:p>
+    <w:p>
+      <w:pPr>
+        <w:jc w:val="center"/>
+        <w:shd w:val="clear" w:fill="EDEDED"/>
+        <w:pBdr>
+          <w:top w:val="single" w:sz="6" w:color="999999"/>
+          <w:left w:val="single" w:sz="6" w:color="999999"/>
+          <w:bottom w:val="single" w:sz="6" w:color="999999"/>
+          <w:right w:val="single" w:sz="6" w:color="999999"/>
+        </w:pBdr>
+      </w:pPr>
+      <w:r>
+        <w:rPr>
+          <w:rFonts w:ascii="Times New Roman" w:hAnsi="Times New Roman"/>
+          <w:color w:val="666666"/>
+          <w:sz w:val="22"/>
+        </w:rPr>
+        <w:t>[ INSERT SCREENSHOT for IR-14 HERE ]</w:t>
+        <w:br/>
+        <w:t>Double-click here after inserting: recommended content – query as entered, full system response showing safety fields, and visible timestamp.</w:t>
+      </w:r>
+    </w:p>
+    <w:p>
+      <w:pPr>
+        <w:jc w:val="center"/>
+      </w:pPr>
+      <w:r>
+        <w:rPr>
+          <w:rFonts w:ascii="Times New Roman" w:hAnsi="Times New Roman"/>
+          <w:i/>
+          <w:sz w:val="20"/>
+        </w:rPr>
+        <w:t>Figure A.14: Supporting evidence for test IR-14. Author to add one-line observation below the image.</w:t>
+      </w:r>
+    </w:p>
+    <w:p>
+      <w:pPr>
+        <w:pStyle w:val="Heading2"/>
+      </w:pPr>
+      <w:r>
+        <w:t>Figure A.15 – Evidence for IR-15</w:t>
+      </w:r>
+    </w:p>
+    <w:p>
+      <w:pPr>
+        <w:jc w:val="center"/>
+        <w:shd w:val="clear" w:fill="EDEDED"/>
+        <w:pBdr>
+          <w:top w:val="single" w:sz="6" w:color="999999"/>
+          <w:left w:val="single" w:sz="6" w:color="999999"/>
+          <w:bottom w:val="single" w:sz="6" w:color="999999"/>
+          <w:right w:val="single" w:sz="6" w:color="999999"/>
+        </w:pBdr>
+      </w:pPr>
+      <w:r>
+        <w:rPr>
+          <w:rFonts w:ascii="Times New Roman" w:hAnsi="Times New Roman"/>
+          <w:color w:val="666666"/>
+          <w:sz w:val="22"/>
+        </w:rPr>
+        <w:t>[ INSERT SCREENSHOT for IR-15 HERE ]</w:t>
+        <w:br/>
+        <w:t>Double-click here after inserting: recommended content – query as entered, full system response showing safety fields, and visible timestamp.</w:t>
+      </w:r>
+    </w:p>
+    <w:p>
+      <w:pPr>
+        <w:jc w:val="center"/>
+      </w:pPr>
+      <w:r>
+        <w:rPr>
+          <w:rFonts w:ascii="Times New Roman" w:hAnsi="Times New Roman"/>
+          <w:i/>
+          <w:sz w:val="20"/>
+        </w:rPr>
+        <w:t>Figure A.15: Supporting evidence for test IR-15. Author to add one-line observation below the image.</w:t>
+      </w:r>
+    </w:p>
+    <w:p>
+      <w:pPr>
+        <w:pStyle w:val="Heading2"/>
+      </w:pPr>
+      <w:r>
+        <w:t>Evidence Traceability</w:t>
+      </w:r>
+    </w:p>
+    <w:tbl>
+      <w:tblPr>
+        <w:tblStyle w:val="LightGrid-Accent1"/>
+        <w:tblW w:type="auto" w:w="0"/>
+        <w:tblLayout w:type="autofit"/>
+        <w:tblLook w:firstColumn="1" w:firstRow="1" w:lastColumn="0" w:lastRow="0" w:noHBand="0" w:noVBand="1" w:val="04A0"/>
+      </w:tblPr>
+      <w:tblGrid>
+        <w:gridCol w:w="4500"/>
+        <w:gridCol w:w="4500"/>
+      </w:tblGrid>
+      <w:tr>
+        <w:tc>
+          <w:tcPr>
+            <w:tcW w:type="dxa" w:w="4500"/>
+          </w:tcPr>
+          <w:p>
+            <w:r/>
+            <w:r>
+              <w:rPr>
+                <w:rFonts w:ascii="Times New Roman" w:hAnsi="Times New Roman"/>
+                <w:b/>
+                <w:sz w:val="22"/>
+              </w:rPr>
+              <w:t>Test ID</w:t>
+            </w:r>
+          </w:p>
+        </w:tc>
+        <w:tc>
+          <w:tcPr>
+            <w:tcW w:type="dxa" w:w="4500"/>
+          </w:tcPr>
+          <w:p>
+            <w:r/>
+            <w:r>
+              <w:rPr>
+                <w:rFonts w:ascii="Times New Roman" w:hAnsi="Times New Roman"/>
+                <w:b/>
+                <w:sz w:val="22"/>
+              </w:rPr>
+              <w:t>Figure</w:t>
+            </w:r>
+          </w:p>
+        </w:tc>
+      </w:tr>
+      <w:tr>
+        <w:tc>
+          <w:tcPr>
+            <w:tcW w:type="dxa" w:w="4500"/>
+          </w:tcPr>
+          <w:p>
+            <w:r/>
+            <w:r>
+              <w:rPr>
+                <w:rFonts w:ascii="Times New Roman" w:hAnsi="Times New Roman"/>
+                <w:sz w:val="22"/>
+              </w:rPr>
+              <w:t>IR-01</w:t>
+            </w:r>
+          </w:p>
+        </w:tc>
+        <w:tc>
+          <w:tcPr>
+            <w:tcW w:type="dxa" w:w="4500"/>
+          </w:tcPr>
+          <w:p>
+            <w:r/>
+            <w:r>
+              <w:rPr>
+                <w:rFonts w:ascii="Times New Roman" w:hAnsi="Times New Roman"/>
+                <w:sz w:val="22"/>
+              </w:rPr>
+              <w:t>Figure A.1</w:t>
+            </w:r>
+          </w:p>
+        </w:tc>
+      </w:tr>
+      <w:tr>
+        <w:tc>
+          <w:tcPr>
+            <w:tcW w:type="dxa" w:w="4500"/>
+          </w:tcPr>
+          <w:p>
+            <w:r/>
+            <w:r>
+              <w:rPr>
+                <w:rFonts w:ascii="Times New Roman" w:hAnsi="Times New Roman"/>
+                <w:sz w:val="22"/>
+              </w:rPr>
+              <w:t>IR-02</w:t>
+            </w:r>
+          </w:p>
+        </w:tc>
+        <w:tc>
+          <w:tcPr>
+            <w:tcW w:type="dxa" w:w="4500"/>
+          </w:tcPr>
+          <w:p>
+            <w:r/>
+            <w:r>
+              <w:rPr>
+                <w:rFonts w:ascii="Times New Roman" w:hAnsi="Times New Roman"/>
+                <w:sz w:val="22"/>
+              </w:rPr>
+              <w:t>Figure A.2</w:t>
+            </w:r>
+          </w:p>
+        </w:tc>
+      </w:tr>
+      <w:tr>
+        <w:tc>
+          <w:tcPr>
+            <w:tcW w:type="dxa" w:w="4500"/>
+          </w:tcPr>
+          <w:p>
+            <w:r/>
+            <w:r>
+              <w:rPr>
+                <w:rFonts w:ascii="Times New Roman" w:hAnsi="Times New Roman"/>
+                <w:sz w:val="22"/>
+              </w:rPr>
+              <w:t>IR-03</w:t>
+            </w:r>
+          </w:p>
+        </w:tc>
+        <w:tc>
+          <w:tcPr>
+            <w:tcW w:type="dxa" w:w="4500"/>
+          </w:tcPr>
+          <w:p>
+            <w:r/>
+            <w:r>
+              <w:rPr>
+                <w:rFonts w:ascii="Times New Roman" w:hAnsi="Times New Roman"/>
+                <w:sz w:val="22"/>
+              </w:rPr>
+              <w:t>Figure A.3</w:t>
+            </w:r>
+          </w:p>
+        </w:tc>
+      </w:tr>
+      <w:tr>
+        <w:tc>
+          <w:tcPr>
+            <w:tcW w:type="dxa" w:w="4500"/>
+          </w:tcPr>
+          <w:p>
+            <w:r/>
+            <w:r>
+              <w:rPr>
+                <w:rFonts w:ascii="Times New Roman" w:hAnsi="Times New Roman"/>
+                <w:sz w:val="22"/>
+              </w:rPr>
+              <w:t>IR-04</w:t>
+            </w:r>
+          </w:p>
+        </w:tc>
+        <w:tc>
+          <w:tcPr>
+            <w:tcW w:type="dxa" w:w="4500"/>
+          </w:tcPr>
+          <w:p>
+            <w:r/>
+            <w:r>
+              <w:rPr>
+                <w:rFonts w:ascii="Times New Roman" w:hAnsi="Times New Roman"/>
+                <w:sz w:val="22"/>
+              </w:rPr>
+              <w:t>Figure A.4</w:t>
+            </w:r>
+          </w:p>
+        </w:tc>
+      </w:tr>
+      <w:tr>
+        <w:tc>
+          <w:tcPr>
+            <w:tcW w:type="dxa" w:w="4500"/>
+          </w:tcPr>
+          <w:p>
+            <w:r/>
+            <w:r>
+              <w:rPr>
+                <w:rFonts w:ascii="Times New Roman" w:hAnsi="Times New Roman"/>
+                <w:sz w:val="22"/>
+              </w:rPr>
+              <w:t>IR-05</w:t>
+            </w:r>
+          </w:p>
+        </w:tc>
+        <w:tc>
+          <w:tcPr>
+            <w:tcW w:type="dxa" w:w="4500"/>
+          </w:tcPr>
+          <w:p>
+            <w:r/>
+            <w:r>
+              <w:rPr>
+                <w:rFonts w:ascii="Times New Roman" w:hAnsi="Times New Roman"/>
+                <w:sz w:val="22"/>
+              </w:rPr>
+              <w:t>Figure A.5</w:t>
+            </w:r>
+          </w:p>
+        </w:tc>
+      </w:tr>
+      <w:tr>
+        <w:tc>
+          <w:tcPr>
+            <w:tcW w:type="dxa" w:w="4500"/>
+          </w:tcPr>
+          <w:p>
+            <w:r/>
+            <w:r>
+              <w:rPr>
+                <w:rFonts w:ascii="Times New Roman" w:hAnsi="Times New Roman"/>
+                <w:sz w:val="22"/>
+              </w:rPr>
+              <w:t>IR-06</w:t>
+            </w:r>
+          </w:p>
+        </w:tc>
+        <w:tc>
+          <w:tcPr>
+            <w:tcW w:type="dxa" w:w="4500"/>
+          </w:tcPr>
+          <w:p>
+            <w:r/>
+            <w:r>
+              <w:rPr>
+                <w:rFonts w:ascii="Times New Roman" w:hAnsi="Times New Roman"/>
+                <w:sz w:val="22"/>
+              </w:rPr>
+              <w:t>Figure A.6</w:t>
+            </w:r>
+          </w:p>
+        </w:tc>
+      </w:tr>
+      <w:tr>
+        <w:tc>
+          <w:tcPr>
+            <w:tcW w:type="dxa" w:w="4500"/>
+          </w:tcPr>
+          <w:p>
+            <w:r/>
+            <w:r>
+              <w:rPr>
+                <w:rFonts w:ascii="Times New Roman" w:hAnsi="Times New Roman"/>
+                <w:sz w:val="22"/>
+              </w:rPr>
+              <w:t>IR-07</w:t>
+            </w:r>
+          </w:p>
+        </w:tc>
+        <w:tc>
+          <w:tcPr>
+            <w:tcW w:type="dxa" w:w="4500"/>
+          </w:tcPr>
+          <w:p>
+            <w:r/>
+            <w:r>
+              <w:rPr>
+                <w:rFonts w:ascii="Times New Roman" w:hAnsi="Times New Roman"/>
+                <w:sz w:val="22"/>
+              </w:rPr>
+              <w:t>Figure A.7</w:t>
+            </w:r>
+          </w:p>
+        </w:tc>
+      </w:tr>
+      <w:tr>
+        <w:tc>
+          <w:tcPr>
+            <w:tcW w:type="dxa" w:w="4500"/>
+          </w:tcPr>
+          <w:p>
+            <w:r/>
+            <w:r>
+              <w:rPr>
+                <w:rFonts w:ascii="Times New Roman" w:hAnsi="Times New Roman"/>
+                <w:sz w:val="22"/>
+              </w:rPr>
+              <w:t>IR-08</w:t>
+            </w:r>
+          </w:p>
+        </w:tc>
+        <w:tc>
+          <w:tcPr>
+            <w:tcW w:type="dxa" w:w="4500"/>
+          </w:tcPr>
+          <w:p>
+            <w:r/>
+            <w:r>
+              <w:rPr>
+                <w:rFonts w:ascii="Times New Roman" w:hAnsi="Times New Roman"/>
+                <w:sz w:val="22"/>
+              </w:rPr>
+              <w:t>Figure A.8</w:t>
+            </w:r>
+          </w:p>
+        </w:tc>
+      </w:tr>
+      <w:tr>
+        <w:tc>
+          <w:tcPr>
+            <w:tcW w:type="dxa" w:w="4500"/>
+          </w:tcPr>
+          <w:p>
+            <w:r/>
+            <w:r>
+              <w:rPr>
+                <w:rFonts w:ascii="Times New Roman" w:hAnsi="Times New Roman"/>
+                <w:sz w:val="22"/>
+              </w:rPr>
+              <w:t>IR-09</w:t>
+            </w:r>
+          </w:p>
+        </w:tc>
+        <w:tc>
+          <w:tcPr>
+            <w:tcW w:type="dxa" w:w="4500"/>
+          </w:tcPr>
+          <w:p>
+            <w:r/>
+            <w:r>
+              <w:rPr>
+                <w:rFonts w:ascii="Times New Roman" w:hAnsi="Times New Roman"/>
+                <w:sz w:val="22"/>
+              </w:rPr>
+              <w:t>Figure A.9</w:t>
+            </w:r>
+          </w:p>
+        </w:tc>
+      </w:tr>
+      <w:tr>
+        <w:tc>
+          <w:tcPr>
+            <w:tcW w:type="dxa" w:w="4500"/>
+          </w:tcPr>
+          <w:p>
+            <w:r/>
+            <w:r>
+              <w:rPr>
+                <w:rFonts w:ascii="Times New Roman" w:hAnsi="Times New Roman"/>
+                <w:sz w:val="22"/>
+              </w:rPr>
+              <w:t>IR-10</w:t>
+            </w:r>
+          </w:p>
+        </w:tc>
+        <w:tc>
+          <w:tcPr>
+            <w:tcW w:type="dxa" w:w="4500"/>
+          </w:tcPr>
+          <w:p>
+            <w:r/>
+            <w:r>
+              <w:rPr>
+                <w:rFonts w:ascii="Times New Roman" w:hAnsi="Times New Roman"/>
+                <w:sz w:val="22"/>
+              </w:rPr>
+              <w:t>Figure A.10</w:t>
+            </w:r>
+          </w:p>
+        </w:tc>
+      </w:tr>
+      <w:tr>
+        <w:tc>
+          <w:tcPr>
+            <w:tcW w:type="dxa" w:w="4500"/>
+          </w:tcPr>
+          <w:p>
+            <w:r/>
+            <w:r>
+              <w:rPr>
+                <w:rFonts w:ascii="Times New Roman" w:hAnsi="Times New Roman"/>
+                <w:sz w:val="22"/>
+              </w:rPr>
+              <w:t>IR-11</w:t>
+            </w:r>
+          </w:p>
+        </w:tc>
+        <w:tc>
+          <w:tcPr>
+            <w:tcW w:type="dxa" w:w="4500"/>
+          </w:tcPr>
+          <w:p>
+            <w:r/>
+            <w:r>
+              <w:rPr>
+                <w:rFonts w:ascii="Times New Roman" w:hAnsi="Times New Roman"/>
+                <w:sz w:val="22"/>
+              </w:rPr>
+              <w:t>Figure A.11</w:t>
+            </w:r>
+          </w:p>
+        </w:tc>
+      </w:tr>
+      <w:tr>
+        <w:tc>
+          <w:tcPr>
+            <w:tcW w:type="dxa" w:w="4500"/>
+          </w:tcPr>
+          <w:p>
+            <w:r/>
+            <w:r>
+              <w:rPr>
+                <w:rFonts w:ascii="Times New Roman" w:hAnsi="Times New Roman"/>
+                <w:sz w:val="22"/>
+              </w:rPr>
+              <w:t>IR-12</w:t>
+            </w:r>
+          </w:p>
+        </w:tc>
+        <w:tc>
+          <w:tcPr>
+            <w:tcW w:type="dxa" w:w="4500"/>
+          </w:tcPr>
+          <w:p>
+            <w:r/>
+            <w:r>
+              <w:rPr>
+                <w:rFonts w:ascii="Times New Roman" w:hAnsi="Times New Roman"/>
+                <w:sz w:val="22"/>
+              </w:rPr>
+              <w:t>Figure A.12</w:t>
+            </w:r>
+          </w:p>
+        </w:tc>
+      </w:tr>
+      <w:tr>
+        <w:tc>
+          <w:tcPr>
+            <w:tcW w:type="dxa" w:w="4500"/>
+          </w:tcPr>
+          <w:p>
+            <w:r/>
+            <w:r>
+              <w:rPr>
+                <w:rFonts w:ascii="Times New Roman" w:hAnsi="Times New Roman"/>
+                <w:sz w:val="22"/>
+              </w:rPr>
+              <w:t>IR-13</w:t>
+            </w:r>
+          </w:p>
+        </w:tc>
+        <w:tc>
+          <w:tcPr>
+            <w:tcW w:type="dxa" w:w="4500"/>
+          </w:tcPr>
+          <w:p>
+            <w:r/>
+            <w:r>
+              <w:rPr>
+                <w:rFonts w:ascii="Times New Roman" w:hAnsi="Times New Roman"/>
+                <w:sz w:val="22"/>
+              </w:rPr>
+              <w:t>Figure A.13</w:t>
+            </w:r>
+          </w:p>
+        </w:tc>
+      </w:tr>
+      <w:tr>
+        <w:tc>
+          <w:tcPr>
+            <w:tcW w:type="dxa" w:w="4500"/>
+          </w:tcPr>
+          <w:p>
+            <w:r/>
+            <w:r>
+              <w:rPr>
+                <w:rFonts w:ascii="Times New Roman" w:hAnsi="Times New Roman"/>
+                <w:sz w:val="22"/>
+              </w:rPr>
+              <w:t>IR-14</w:t>
+            </w:r>
+          </w:p>
+        </w:tc>
+        <w:tc>
+          <w:tcPr>
+            <w:tcW w:type="dxa" w:w="4500"/>
+          </w:tcPr>
+          <w:p>
+            <w:r/>
+            <w:r>
+              <w:rPr>
+                <w:rFonts w:ascii="Times New Roman" w:hAnsi="Times New Roman"/>
+                <w:sz w:val="22"/>
+              </w:rPr>
+              <w:t>Figure A.14</w:t>
+            </w:r>
+          </w:p>
+        </w:tc>
+      </w:tr>
+      <w:tr>
+        <w:tc>
+          <w:tcPr>
+            <w:tcW w:type="dxa" w:w="4500"/>
+          </w:tcPr>
+          <w:p>
+            <w:r/>
+            <w:r>
+              <w:rPr>
+                <w:rFonts w:ascii="Times New Roman" w:hAnsi="Times New Roman"/>
+                <w:sz w:val="22"/>
+              </w:rPr>
+              <w:t>IR-15</w:t>
+            </w:r>
+          </w:p>
+        </w:tc>
+        <w:tc>
+          <w:tcPr>
+            <w:tcW w:type="dxa" w:w="4500"/>
+          </w:tcPr>
+          <w:p>
+            <w:r/>
+            <w:r>
+              <w:rPr>
+                <w:rFonts w:ascii="Times New Roman" w:hAnsi="Times New Roman"/>
+                <w:sz w:val="22"/>
+              </w:rPr>
+              <w:t>Figure A.15</w:t>
+            </w:r>
+          </w:p>
+        </w:tc>
+      </w:tr>
+    </w:tbl>
+    <w:p/>
     <w:sectPr>
       <w:footerReference w:type="default" r:id="rId9"/>
       <w:pgSz w:w="12240" w:h="15840"/>

</xml_diff>